<commit_message>
Actualizar algoritmos SA y reporte
</commit_message>
<xml_diff>
--- a/Reporte_AU_Analisis_Aprendizaje_Automatico.docx
+++ b/Reporte_AU_Analisis_Aprendizaje_Automatico.docx
@@ -8,7 +8,7 @@
         <w:jc w:val="center"/>
       </w:pPr>
       <w:r>
-        <w:t>ANÁLISIS DE APRENDIZAJE AUTOMÁTICO</w:t>
+        <w:t>EVALUACIÓN 2 · APRENDIZAJE AUTOMÁTICO</w:t>
       </w:r>
     </w:p>
     <w:p>
@@ -17,10 +17,9 @@
       </w:pPr>
       <w:r>
         <w:rPr>
-          <w:color w:val="464646"/>
           <w:sz w:val="28"/>
         </w:rPr>
-        <w:t>Evaluaciones SA, DE y AU · Regresión, clasificación, agrupación y reducción dimensional</w:t>
+        <w:t>SA, DE y AU · Reporte reproducible</w:t>
       </w:r>
     </w:p>
     <w:p>
@@ -28,7 +27,7 @@
         <w:jc w:val="center"/>
       </w:pPr>
       <w:r>
-        <w:t>Herramienta alternativa para AU: reporte Word generado a partir de los mismos datos, modelos, métricas y visualizaciones reproducibles.</w:t>
+        <w:t>Repositorio público: https://github.com/axelisaak10/evaluacion-2</w:t>
       </w:r>
     </w:p>
     <w:p>
@@ -46,7 +45,7 @@
     </w:p>
     <w:p>
       <w:r>
-        <w:t>Se construyeron seis análisis reproducibles. En supervisado, Random Forest obtuvo R²=-0.335 en béisbol y el árbol alcanzó AUC=0.898 en cáncer. Como alternativas DE, Ridge obtuvo R²=-0.279 y la regresión logística AUC=0.995. En no supervisado, K-means seleccionó k=3 por silhouette y PCA requirió 6 componentes para conservar al menos 90% de varianza.</w:t>
+        <w:t>SA compara regresión lineal con Ridge y regresión logística con árbol de decisión; además aplica K-means y PCA. DE usa Random Forest y SVM como alternativas distintas. Todos los modelos supervisados conservan prueba aislada y optimización por validación cruzada.</w:t>
       </w:r>
     </w:p>
     <w:p>
@@ -54,69 +53,22 @@
         <w:pStyle w:val="Heading1"/>
       </w:pPr>
       <w:r>
-        <w:t>Metodología común</w:t>
-      </w:r>
-    </w:p>
-    <w:p>
-      <w:pPr>
-        <w:pStyle w:val="ListBullet"/>
-      </w:pPr>
-      <w:r>
-        <w:t>Carga y auditoría de dimensiones, tipos, faltantes e identificadores.</w:t>
-      </w:r>
-    </w:p>
-    <w:p>
-      <w:pPr>
-        <w:pStyle w:val="ListBullet"/>
-      </w:pPr>
-      <w:r>
-        <w:t>Separación entrenamiento/prueba antes de optimizar modelos supervisados.</w:t>
-      </w:r>
-    </w:p>
-    <w:p>
-      <w:pPr>
-        <w:pStyle w:val="ListBullet"/>
-      </w:pPr>
-      <w:r>
-        <w:t>Búsqueda de hiperparámetros con validación cruzada y métrica adecuada.</w:t>
-      </w:r>
-    </w:p>
-    <w:p>
-      <w:pPr>
-        <w:pStyle w:val="ListBullet"/>
-      </w:pPr>
-      <w:r>
-        <w:t>Evaluación final sobre prueba, persistencia con joblib y visualización interpretativa.</w:t>
-      </w:r>
-    </w:p>
-    <w:p>
-      <w:pPr>
-        <w:pStyle w:val="Heading1"/>
-      </w:pPr>
-      <w:r>
-        <w:t>SA 1. Regresión de béisbol - Random Forest</w:t>
+        <w:t>SA 1. Regresión lineal y Ridge</w:t>
       </w:r>
     </w:p>
     <w:p>
       <w:r>
-        <w:rPr>
-          <w:b/>
-        </w:rPr>
-        <w:t xml:space="preserve">Repositorio del modelo: </w:t>
+        <w:t>Repositorio del modelo: https://github.com/axelisaak10/evaluacion-2</w:t>
       </w:r>
-      <w:hyperlink r:id="rId23">
-        <w:r>
-          <w:rPr>
-            <w:color w:val="0563C1"/>
-            <w:u w:val="single"/>
-          </w:rPr>
-          <w:t>https://github.com/axelisaak10/evaluacion-2</w:t>
-        </w:r>
-      </w:hyperlink>
     </w:p>
     <w:p>
       <w:r>
-        <w:t>Justificación: el ensamble modela relaciones no lineales y reduce la varianza al promediar árboles. Diseño: predictor bateos, objetivo runs, partición 75/25, GridSearchCV de cinco pliegues y evaluación final aislada. La muestra es pequeña (30 equipos), por lo que las métricas deben interpretarse con cautela.</w:t>
+        <w:t>Justificación: La regresión lineal ofrece una referencia transparente; Ridge controla la magnitud del coeficiente mediante regularización L2.</w:t>
+      </w:r>
+    </w:p>
+    <w:p>
+      <w:r>
+        <w:t>Diseño: Bateos predice runs; división 75/25; cinco pliegues. Ridge busca alpha entre 0.001 y 1000; ambos se comparan con MAE, RMSE y R².</w:t>
       </w:r>
     </w:p>
     <w:p>
@@ -132,12 +84,11 @@
         <w:tblStyle w:val="TableGrid"/>
         <w:tblW w:type="auto" w:w="0"/>
         <w:jc w:val="center"/>
-        <w:tblLayout w:type="fixed"/>
         <w:tblLook w:firstColumn="1" w:firstRow="1" w:lastColumn="0" w:lastRow="0" w:noHBand="0" w:noVBand="1" w:val="04A0"/>
       </w:tblPr>
       <w:tblGrid>
-        <w:gridCol w:w="3312"/>
-        <w:gridCol w:w="6048"/>
+        <w:gridCol w:w="4680"/>
+        <w:gridCol w:w="4680"/>
       </w:tblGrid>
       <w:tr>
         <w:tc>
@@ -166,23 +117,23 @@
       <w:tr>
         <w:tc>
           <w:tcPr>
-            <w:tcW w:type="dxa" w:w="3312"/>
+            <w:tcW w:type="dxa" w:w="4680"/>
             <w:vAlign w:val="center"/>
           </w:tcPr>
           <w:p>
             <w:r>
-              <w:t>MAE</w:t>
+              <w:t>Lineal R2</w:t>
             </w:r>
           </w:p>
         </w:tc>
         <w:tc>
           <w:tcPr>
-            <w:tcW w:type="dxa" w:w="6048"/>
+            <w:tcW w:type="dxa" w:w="4680"/>
             <w:vAlign w:val="center"/>
           </w:tcPr>
           <w:p>
             <w:r>
-              <w:t>54.1543</w:t>
+              <w:t>-0.3291</w:t>
             </w:r>
           </w:p>
         </w:tc>
@@ -190,23 +141,23 @@
       <w:tr>
         <w:tc>
           <w:tcPr>
-            <w:tcW w:type="dxa" w:w="3312"/>
+            <w:tcW w:type="dxa" w:w="4680"/>
             <w:vAlign w:val="center"/>
           </w:tcPr>
           <w:p>
             <w:r>
-              <w:t>RMSE</w:t>
+              <w:t>Lineal RMSE</w:t>
             </w:r>
           </w:p>
         </w:tc>
         <w:tc>
           <w:tcPr>
-            <w:tcW w:type="dxa" w:w="6048"/>
+            <w:tcW w:type="dxa" w:w="4680"/>
             <w:vAlign w:val="center"/>
           </w:tcPr>
           <w:p>
             <w:r>
-              <w:t>67.6316</w:t>
+              <w:t>67.4919</w:t>
             </w:r>
           </w:p>
         </w:tc>
@@ -214,23 +165,23 @@
       <w:tr>
         <w:tc>
           <w:tcPr>
-            <w:tcW w:type="dxa" w:w="3312"/>
+            <w:tcW w:type="dxa" w:w="4680"/>
             <w:vAlign w:val="center"/>
           </w:tcPr>
           <w:p>
             <w:r>
-              <w:t>R2</w:t>
+              <w:t>Ridge R2</w:t>
             </w:r>
           </w:p>
         </w:tc>
         <w:tc>
           <w:tcPr>
-            <w:tcW w:type="dxa" w:w="6048"/>
+            <w:tcW w:type="dxa" w:w="4680"/>
             <w:vAlign w:val="center"/>
           </w:tcPr>
           <w:p>
             <w:r>
-              <w:t>-0.3346</w:t>
+              <w:t>-0.2786</w:t>
             </w:r>
           </w:p>
         </w:tc>
@@ -238,23 +189,23 @@
       <w:tr>
         <w:tc>
           <w:tcPr>
-            <w:tcW w:type="dxa" w:w="3312"/>
+            <w:tcW w:type="dxa" w:w="4680"/>
             <w:vAlign w:val="center"/>
           </w:tcPr>
           <w:p>
             <w:r>
-              <w:t>CV RMSE</w:t>
+              <w:t>Ridge RMSE</w:t>
             </w:r>
           </w:p>
         </w:tc>
         <w:tc>
           <w:tcPr>
-            <w:tcW w:type="dxa" w:w="6048"/>
+            <w:tcW w:type="dxa" w:w="4680"/>
             <w:vAlign w:val="center"/>
           </w:tcPr>
           <w:p>
             <w:r>
-              <w:t>81.1759</w:t>
+              <w:t>66.1970</w:t>
             </w:r>
           </w:p>
         </w:tc>
@@ -262,23 +213,23 @@
       <w:tr>
         <w:tc>
           <w:tcPr>
-            <w:tcW w:type="dxa" w:w="3312"/>
+            <w:tcW w:type="dxa" w:w="4680"/>
             <w:vAlign w:val="center"/>
           </w:tcPr>
           <w:p>
             <w:r>
-              <w:t>Mejores parámetros</w:t>
+              <w:t>Ridge parámetros</w:t>
             </w:r>
           </w:p>
         </w:tc>
         <w:tc>
           <w:tcPr>
-            <w:tcW w:type="dxa" w:w="6048"/>
+            <w:tcW w:type="dxa" w:w="4680"/>
             <w:vAlign w:val="center"/>
           </w:tcPr>
           <w:p>
             <w:r>
-              <w:t>{'max_depth': None, 'max_features': 1.0, 'min_samples_leaf': 3, 'n_estimators': 300}</w:t>
+              <w:t>{'ridge__alpha': 10}</w:t>
             </w:r>
           </w:p>
         </w:tc>
@@ -288,7 +239,7 @@
       <w:r>
         <w:drawing>
           <wp:inline xmlns:a="http://schemas.openxmlformats.org/drawingml/2006/main" xmlns:pic="http://schemas.openxmlformats.org/drawingml/2006/picture">
-            <wp:extent cx="5760720" cy="3543494"/>
+            <wp:extent cx="5577840" cy="3431002"/>
             <wp:docPr id="1" name="Picture 1"/>
             <wp:cNvGraphicFramePr>
               <a:graphicFrameLocks noChangeAspect="1"/>
@@ -297,11 +248,11 @@
               <a:graphicData uri="http://schemas.openxmlformats.org/drawingml/2006/picture">
                 <pic:pic>
                   <pic:nvPicPr>
-                    <pic:cNvPr id="0" name="sa_beisbol_dispersion.png"/>
+                    <pic:cNvPr id="0" name="sa_regresion_lineal_ridge.png"/>
                     <pic:cNvPicPr/>
                   </pic:nvPicPr>
                   <pic:blipFill>
-                    <a:blip r:embed="rId11"/>
+                    <a:blip r:embed="rId9"/>
                     <a:stretch>
                       <a:fillRect/>
                     </a:stretch>
@@ -309,7 +260,7 @@
                   <pic:spPr>
                     <a:xfrm>
                       <a:off x="0" y="0"/>
-                      <a:ext cx="5760720" cy="3543494"/>
+                      <a:ext cx="5577840" cy="3431002"/>
                     </a:xfrm>
                     <a:prstGeom prst="rect"/>
                   </pic:spPr>
@@ -324,7 +275,7 @@
       <w:r>
         <w:drawing>
           <wp:inline xmlns:a="http://schemas.openxmlformats.org/drawingml/2006/main" xmlns:pic="http://schemas.openxmlformats.org/drawingml/2006/picture">
-            <wp:extent cx="5029200" cy="5005388"/>
+            <wp:extent cx="5577840" cy="2503119"/>
             <wp:docPr id="2" name="Picture 2"/>
             <wp:cNvGraphicFramePr>
               <a:graphicFrameLocks noChangeAspect="1"/>
@@ -333,11 +284,11 @@
               <a:graphicData uri="http://schemas.openxmlformats.org/drawingml/2006/picture">
                 <pic:pic>
                   <pic:nvPicPr>
-                    <pic:cNvPr id="0" name="sa_beisbol_real_vs_predicho.png"/>
+                    <pic:cNvPr id="0" name="sa_regresion_real_vs_predicho.png"/>
                     <pic:cNvPicPr/>
                   </pic:nvPicPr>
                   <pic:blipFill>
-                    <a:blip r:embed="rId12"/>
+                    <a:blip r:embed="rId10"/>
                     <a:stretch>
                       <a:fillRect/>
                     </a:stretch>
@@ -345,7 +296,7 @@
                   <pic:spPr>
                     <a:xfrm>
                       <a:off x="0" y="0"/>
-                      <a:ext cx="5029200" cy="5005388"/>
+                      <a:ext cx="5577840" cy="2503119"/>
                     </a:xfrm>
                     <a:prstGeom prst="rect"/>
                   </pic:spPr>
@@ -358,7 +309,7 @@
     </w:p>
     <w:p>
       <w:r>
-        <w:t>Interpretación: existe asociación positiva general entre bateos y carreras. La cercanía a la diagonal indica precisión; las desviaciones reflejan factores ofensivos omitidos.</w:t>
+        <w:t>Interpretación: la pendiente resume la asociación positiva, pero el R² de prueba advierte que bateos por sí solo no generaliza bien en una muestra de 30 equipos.</w:t>
       </w:r>
     </w:p>
     <w:p>
@@ -366,29 +317,22 @@
         <w:pStyle w:val="Heading1"/>
       </w:pPr>
       <w:r>
-        <w:t>SA 2. Clasificación de cáncer - Árbol</w:t>
+        <w:t>SA 2. Regresión logística y árbol de decisión</w:t>
       </w:r>
     </w:p>
     <w:p>
       <w:r>
-        <w:rPr>
-          <w:b/>
-        </w:rPr>
-        <w:t xml:space="preserve">Repositorio del modelo: </w:t>
+        <w:t>Repositorio del modelo: https://github.com/axelisaak10/evaluacion-2</w:t>
       </w:r>
-      <w:hyperlink r:id="rId23">
-        <w:r>
-          <w:rPr>
-            <w:color w:val="0563C1"/>
-            <w:u w:val="single"/>
-          </w:rPr>
-          <w:t>https://github.com/axelisaak10/evaluacion-2</w:t>
-        </w:r>
-      </w:hyperlink>
     </w:p>
     <w:p>
       <w:r>
-        <w:t>Justificación: produce reglas explícitas y un árbol completo interpretable. Se eliminó id, se codificó maligno como 1, se dividió 80/20 con estratificación y se optimizaron criterio, profundidad, mínimos de división/hoja y poda usando AUC.</w:t>
+        <w:t>Justificación: La logística produce probabilidades y el árbol reglas visuales; juntos permiten comparar un modelo lineal con uno no lineal.</w:t>
+      </w:r>
+    </w:p>
+    <w:p>
+      <w:r>
+        <w:t>Diseño: Se elimina id, M=1, división estratificada 80/20. Logística optimiza C y penalización; árbol optimiza criterio, profundidad, hojas y poda usando AUC.</w:t>
       </w:r>
     </w:p>
     <w:p>
@@ -404,12 +348,11 @@
         <w:tblStyle w:val="TableGrid"/>
         <w:tblW w:type="auto" w:w="0"/>
         <w:jc w:val="center"/>
-        <w:tblLayout w:type="fixed"/>
         <w:tblLook w:firstColumn="1" w:firstRow="1" w:lastColumn="0" w:lastRow="0" w:noHBand="0" w:noVBand="1" w:val="04A0"/>
       </w:tblPr>
       <w:tblGrid>
-        <w:gridCol w:w="3312"/>
-        <w:gridCol w:w="6048"/>
+        <w:gridCol w:w="4680"/>
+        <w:gridCol w:w="4680"/>
       </w:tblGrid>
       <w:tr>
         <w:tc>
@@ -438,23 +381,23 @@
       <w:tr>
         <w:tc>
           <w:tcPr>
-            <w:tcW w:type="dxa" w:w="3312"/>
+            <w:tcW w:type="dxa" w:w="4680"/>
             <w:vAlign w:val="center"/>
           </w:tcPr>
           <w:p>
             <w:r>
-              <w:t>accuracy</w:t>
+              <w:t>Logística AUC</w:t>
             </w:r>
           </w:p>
         </w:tc>
         <w:tc>
           <w:tcPr>
-            <w:tcW w:type="dxa" w:w="6048"/>
+            <w:tcW w:type="dxa" w:w="4680"/>
             <w:vAlign w:val="center"/>
           </w:tcPr>
           <w:p>
             <w:r>
-              <w:t>0.9035</w:t>
+              <w:t>0.9954</w:t>
             </w:r>
           </w:p>
         </w:tc>
@@ -462,23 +405,23 @@
       <w:tr>
         <w:tc>
           <w:tcPr>
-            <w:tcW w:type="dxa" w:w="3312"/>
+            <w:tcW w:type="dxa" w:w="4680"/>
             <w:vAlign w:val="center"/>
           </w:tcPr>
           <w:p>
             <w:r>
-              <w:t>precision</w:t>
+              <w:t>Logística recall</w:t>
             </w:r>
           </w:p>
         </w:tc>
         <w:tc>
           <w:tcPr>
-            <w:tcW w:type="dxa" w:w="6048"/>
+            <w:tcW w:type="dxa" w:w="4680"/>
             <w:vAlign w:val="center"/>
           </w:tcPr>
           <w:p>
             <w:r>
-              <w:t>0.8974</w:t>
+              <w:t>0.9524</w:t>
             </w:r>
           </w:p>
         </w:tc>
@@ -486,66 +429,18 @@
       <w:tr>
         <w:tc>
           <w:tcPr>
-            <w:tcW w:type="dxa" w:w="3312"/>
+            <w:tcW w:type="dxa" w:w="4680"/>
             <w:vAlign w:val="center"/>
           </w:tcPr>
           <w:p>
             <w:r>
-              <w:t>recall</w:t>
+              <w:t>Árbol AUC</w:t>
             </w:r>
           </w:p>
         </w:tc>
         <w:tc>
           <w:tcPr>
-            <w:tcW w:type="dxa" w:w="6048"/>
-            <w:vAlign w:val="center"/>
-          </w:tcPr>
-          <w:p>
-            <w:r>
-              <w:t>0.8333</w:t>
-            </w:r>
-          </w:p>
-        </w:tc>
-      </w:tr>
-      <w:tr>
-        <w:tc>
-          <w:tcPr>
-            <w:tcW w:type="dxa" w:w="3312"/>
-            <w:vAlign w:val="center"/>
-          </w:tcPr>
-          <w:p>
-            <w:r>
-              <w:t>f1</w:t>
-            </w:r>
-          </w:p>
-        </w:tc>
-        <w:tc>
-          <w:tcPr>
-            <w:tcW w:type="dxa" w:w="6048"/>
-            <w:vAlign w:val="center"/>
-          </w:tcPr>
-          <w:p>
-            <w:r>
-              <w:t>0.8642</w:t>
-            </w:r>
-          </w:p>
-        </w:tc>
-      </w:tr>
-      <w:tr>
-        <w:tc>
-          <w:tcPr>
-            <w:tcW w:type="dxa" w:w="3312"/>
-            <w:vAlign w:val="center"/>
-          </w:tcPr>
-          <w:p>
-            <w:r>
-              <w:t>roc_auc</w:t>
-            </w:r>
-          </w:p>
-        </w:tc>
-        <w:tc>
-          <w:tcPr>
-            <w:tcW w:type="dxa" w:w="6048"/>
+            <w:tcW w:type="dxa" w:w="4680"/>
             <w:vAlign w:val="center"/>
           </w:tcPr>
           <w:p>
@@ -558,47 +453,23 @@
       <w:tr>
         <w:tc>
           <w:tcPr>
-            <w:tcW w:type="dxa" w:w="3312"/>
+            <w:tcW w:type="dxa" w:w="4680"/>
             <w:vAlign w:val="center"/>
           </w:tcPr>
           <w:p>
             <w:r>
-              <w:t>CV AUC</w:t>
+              <w:t>Árbol recall</w:t>
             </w:r>
           </w:p>
         </w:tc>
         <w:tc>
           <w:tcPr>
-            <w:tcW w:type="dxa" w:w="6048"/>
+            <w:tcW w:type="dxa" w:w="4680"/>
             <w:vAlign w:val="center"/>
           </w:tcPr>
           <w:p>
             <w:r>
-              <w:t>0.9727</w:t>
-            </w:r>
-          </w:p>
-        </w:tc>
-      </w:tr>
-      <w:tr>
-        <w:tc>
-          <w:tcPr>
-            <w:tcW w:type="dxa" w:w="3312"/>
-            <w:vAlign w:val="center"/>
-          </w:tcPr>
-          <w:p>
-            <w:r>
-              <w:t>Mejores parámetros</w:t>
-            </w:r>
-          </w:p>
-        </w:tc>
-        <w:tc>
-          <w:tcPr>
-            <w:tcW w:type="dxa" w:w="6048"/>
-            <w:vAlign w:val="center"/>
-          </w:tcPr>
-          <w:p>
-            <w:r>
-              <w:t>{'ccp_alpha': 0, 'criterion': 'gini', 'max_depth': 5, 'min_samples_leaf': 4, 'min_samples_split': 10}</w:t>
+              <w:t>0.8333</w:t>
             </w:r>
           </w:p>
         </w:tc>
@@ -608,7 +479,7 @@
       <w:r>
         <w:drawing>
           <wp:inline xmlns:a="http://schemas.openxmlformats.org/drawingml/2006/main" xmlns:pic="http://schemas.openxmlformats.org/drawingml/2006/picture">
-            <wp:extent cx="5943600" cy="2947666"/>
+            <wp:extent cx="5577840" cy="2766271"/>
             <wp:docPr id="3" name="Picture 3"/>
             <wp:cNvGraphicFramePr>
               <a:graphicFrameLocks noChangeAspect="1"/>
@@ -621,7 +492,7 @@
                     <pic:cNvPicPr/>
                   </pic:nvPicPr>
                   <pic:blipFill>
-                    <a:blip r:embed="rId13"/>
+                    <a:blip r:embed="rId11"/>
                     <a:stretch>
                       <a:fillRect/>
                     </a:stretch>
@@ -629,7 +500,7 @@
                   <pic:spPr>
                     <a:xfrm>
                       <a:off x="0" y="0"/>
-                      <a:ext cx="5943600" cy="2947666"/>
+                      <a:ext cx="5577840" cy="2766271"/>
                     </a:xfrm>
                     <a:prstGeom prst="rect"/>
                   </pic:spPr>
@@ -644,7 +515,7 @@
       <w:r>
         <w:drawing>
           <wp:inline xmlns:a="http://schemas.openxmlformats.org/drawingml/2006/main" xmlns:pic="http://schemas.openxmlformats.org/drawingml/2006/picture">
-            <wp:extent cx="4389120" cy="3811489"/>
+            <wp:extent cx="5577840" cy="2280674"/>
             <wp:docPr id="4" name="Picture 4"/>
             <wp:cNvGraphicFramePr>
               <a:graphicFrameLocks noChangeAspect="1"/>
@@ -653,11 +524,11 @@
               <a:graphicData uri="http://schemas.openxmlformats.org/drawingml/2006/picture">
                 <pic:pic>
                   <pic:nvPicPr>
-                    <pic:cNvPr id="0" name="sa_matriz_confusion.png"/>
+                    <pic:cNvPr id="0" name="sa_clasificacion_comparacion.png"/>
                     <pic:cNvPicPr/>
                   </pic:nvPicPr>
                   <pic:blipFill>
-                    <a:blip r:embed="rId14"/>
+                    <a:blip r:embed="rId12"/>
                     <a:stretch>
                       <a:fillRect/>
                     </a:stretch>
@@ -665,7 +536,7 @@
                   <pic:spPr>
                     <a:xfrm>
                       <a:off x="0" y="0"/>
-                      <a:ext cx="4389120" cy="3811489"/>
+                      <a:ext cx="5577840" cy="2280674"/>
                     </a:xfrm>
                     <a:prstGeom prst="rect"/>
                   </pic:spPr>
@@ -678,7 +549,43 @@
     </w:p>
     <w:p>
       <w:r>
-        <w:t>Interpretación: el árbol prioriza características que separan tumores benignos y malignos. Recall cuantifica la capacidad de detectar malignos; los falsos negativos requieren especial atención.</w:t>
+        <w:drawing>
+          <wp:inline xmlns:a="http://schemas.openxmlformats.org/drawingml/2006/main" xmlns:pic="http://schemas.openxmlformats.org/drawingml/2006/picture">
+            <wp:extent cx="5577840" cy="5638615"/>
+            <wp:docPr id="5" name="Picture 5"/>
+            <wp:cNvGraphicFramePr>
+              <a:graphicFrameLocks noChangeAspect="1"/>
+            </wp:cNvGraphicFramePr>
+            <a:graphic>
+              <a:graphicData uri="http://schemas.openxmlformats.org/drawingml/2006/picture">
+                <pic:pic>
+                  <pic:nvPicPr>
+                    <pic:cNvPr id="0" name="sa_clasificacion_roc.png"/>
+                    <pic:cNvPicPr/>
+                  </pic:nvPicPr>
+                  <pic:blipFill>
+                    <a:blip r:embed="rId13"/>
+                    <a:stretch>
+                      <a:fillRect/>
+                    </a:stretch>
+                  </pic:blipFill>
+                  <pic:spPr>
+                    <a:xfrm>
+                      <a:off x="0" y="0"/>
+                      <a:ext cx="5577840" cy="5638615"/>
+                    </a:xfrm>
+                    <a:prstGeom prst="rect"/>
+                  </pic:spPr>
+                </pic:pic>
+              </a:graphicData>
+            </a:graphic>
+          </wp:inline>
+        </w:drawing>
+      </w:r>
+    </w:p>
+    <w:p>
+      <w:r>
+        <w:t>Interpretación: la logística discrimina mejor en esta partición; el árbol aporta reglas interpretables. Recall es crítico por los falsos negativos.</w:t>
       </w:r>
     </w:p>
     <w:p>
@@ -686,29 +593,22 @@
         <w:pStyle w:val="Heading1"/>
       </w:pPr>
       <w:r>
-        <w:t>SA 3. Agrupación Samsung - K-means</w:t>
+        <w:t>SA 3. K-means</w:t>
       </w:r>
     </w:p>
     <w:p>
       <w:r>
-        <w:rPr>
-          <w:b/>
-        </w:rPr>
-        <w:t xml:space="preserve">Repositorio del modelo: </w:t>
+        <w:t>Repositorio del modelo: https://github.com/axelisaak10/evaluacion-2</w:t>
       </w:r>
-      <w:hyperlink r:id="rId23">
-        <w:r>
-          <w:rPr>
-            <w:color w:val="0563C1"/>
-            <w:u w:val="single"/>
-          </w:rPr>
-          <w:t>https://github.com/axelisaak10/evaluacion-2</w:t>
-        </w:r>
-      </w:hyperlink>
     </w:p>
     <w:p>
       <w:r>
-        <w:t>Justificación: identifica regímenes compactos de precio y volumen. Ambas variables se estandarizaron. Se compararon k=2 a 8 con silhouette, Calinski-Harabasz y Davies-Bouldin; el mayor silhouette determinó el modelo.</w:t>
+        <w:t>Justificación: K-means identifica regímenes compactos de precio y volumen.</w:t>
+      </w:r>
+    </w:p>
+    <w:p>
+      <w:r>
+        <w:t>Diseño: Se estandarizan variables y se comparan k=2…8 mediante silhouette, Calinski-Harabasz y Davies-Bouldin.</w:t>
       </w:r>
     </w:p>
     <w:p>
@@ -716,7 +616,7 @@
         <w:pStyle w:val="Heading2"/>
       </w:pPr>
       <w:r>
-        <w:t>Optimización</w:t>
+        <w:t>Evaluación y optimización</w:t>
       </w:r>
     </w:p>
     <w:tbl>
@@ -724,12 +624,11 @@
         <w:tblStyle w:val="TableGrid"/>
         <w:tblW w:type="auto" w:w="0"/>
         <w:jc w:val="center"/>
-        <w:tblLayout w:type="fixed"/>
         <w:tblLook w:firstColumn="1" w:firstRow="1" w:lastColumn="0" w:lastRow="0" w:noHBand="0" w:noVBand="1" w:val="04A0"/>
       </w:tblPr>
       <w:tblGrid>
-        <w:gridCol w:w="3312"/>
-        <w:gridCol w:w="6048"/>
+        <w:gridCol w:w="4680"/>
+        <w:gridCol w:w="4680"/>
       </w:tblGrid>
       <w:tr>
         <w:tc>
@@ -758,18 +657,18 @@
       <w:tr>
         <w:tc>
           <w:tcPr>
-            <w:tcW w:type="dxa" w:w="3312"/>
+            <w:tcW w:type="dxa" w:w="4680"/>
             <w:vAlign w:val="center"/>
           </w:tcPr>
           <w:p>
             <w:r>
-              <w:t>k elegido</w:t>
+              <w:t>k</w:t>
             </w:r>
           </w:p>
         </w:tc>
         <w:tc>
           <w:tcPr>
-            <w:tcW w:type="dxa" w:w="6048"/>
+            <w:tcW w:type="dxa" w:w="4680"/>
             <w:vAlign w:val="center"/>
           </w:tcPr>
           <w:p>
@@ -782,7 +681,7 @@
       <w:tr>
         <w:tc>
           <w:tcPr>
-            <w:tcW w:type="dxa" w:w="3312"/>
+            <w:tcW w:type="dxa" w:w="4680"/>
             <w:vAlign w:val="center"/>
           </w:tcPr>
           <w:p>
@@ -793,7 +692,7 @@
         </w:tc>
         <w:tc>
           <w:tcPr>
-            <w:tcW w:type="dxa" w:w="6048"/>
+            <w:tcW w:type="dxa" w:w="4680"/>
             <w:vAlign w:val="center"/>
           </w:tcPr>
           <w:p>
@@ -806,31 +705,7 @@
       <w:tr>
         <w:tc>
           <w:tcPr>
-            <w:tcW w:type="dxa" w:w="3312"/>
-            <w:vAlign w:val="center"/>
-          </w:tcPr>
-          <w:p>
-            <w:r>
-              <w:t>Calinski-Harabasz</w:t>
-            </w:r>
-          </w:p>
-        </w:tc>
-        <w:tc>
-          <w:tcPr>
-            <w:tcW w:type="dxa" w:w="6048"/>
-            <w:vAlign w:val="center"/>
-          </w:tcPr>
-          <w:p>
-            <w:r>
-              <w:t>3520.6561</w:t>
-            </w:r>
-          </w:p>
-        </w:tc>
-      </w:tr>
-      <w:tr>
-        <w:tc>
-          <w:tcPr>
-            <w:tcW w:type="dxa" w:w="3312"/>
+            <w:tcW w:type="dxa" w:w="4680"/>
             <w:vAlign w:val="center"/>
           </w:tcPr>
           <w:p>
@@ -841,7 +716,7 @@
         </w:tc>
         <w:tc>
           <w:tcPr>
-            <w:tcW w:type="dxa" w:w="6048"/>
+            <w:tcW w:type="dxa" w:w="4680"/>
             <w:vAlign w:val="center"/>
           </w:tcPr>
           <w:p>
@@ -856,8 +731,8 @@
       <w:r>
         <w:drawing>
           <wp:inline xmlns:a="http://schemas.openxmlformats.org/drawingml/2006/main" xmlns:pic="http://schemas.openxmlformats.org/drawingml/2006/picture">
-            <wp:extent cx="5303520" cy="3262264"/>
-            <wp:docPr id="5" name="Picture 5"/>
+            <wp:extent cx="5577840" cy="3431002"/>
+            <wp:docPr id="6" name="Picture 6"/>
             <wp:cNvGraphicFramePr>
               <a:graphicFrameLocks noChangeAspect="1"/>
             </wp:cNvGraphicFramePr>
@@ -869,7 +744,7 @@
                     <pic:cNvPicPr/>
                   </pic:nvPicPr>
                   <pic:blipFill>
-                    <a:blip r:embed="rId15"/>
+                    <a:blip r:embed="rId14"/>
                     <a:stretch>
                       <a:fillRect/>
                     </a:stretch>
@@ -877,7 +752,7 @@
                   <pic:spPr>
                     <a:xfrm>
                       <a:off x="0" y="0"/>
-                      <a:ext cx="5303520" cy="3262264"/>
+                      <a:ext cx="5577840" cy="3431002"/>
                     </a:xfrm>
                     <a:prstGeom prst="rect"/>
                   </pic:spPr>
@@ -892,8 +767,8 @@
       <w:r>
         <w:drawing>
           <wp:inline xmlns:a="http://schemas.openxmlformats.org/drawingml/2006/main" xmlns:pic="http://schemas.openxmlformats.org/drawingml/2006/picture">
-            <wp:extent cx="5303520" cy="3947592"/>
-            <wp:docPr id="6" name="Picture 6"/>
+            <wp:extent cx="5577840" cy="4151778"/>
+            <wp:docPr id="7" name="Picture 7"/>
             <wp:cNvGraphicFramePr>
               <a:graphicFrameLocks noChangeAspect="1"/>
             </wp:cNvGraphicFramePr>
@@ -905,7 +780,7 @@
                     <pic:cNvPicPr/>
                   </pic:nvPicPr>
                   <pic:blipFill>
-                    <a:blip r:embed="rId16"/>
+                    <a:blip r:embed="rId15"/>
                     <a:stretch>
                       <a:fillRect/>
                     </a:stretch>
@@ -913,7 +788,7 @@
                   <pic:spPr>
                     <a:xfrm>
                       <a:off x="0" y="0"/>
-                      <a:ext cx="5303520" cy="3947592"/>
+                      <a:ext cx="5577840" cy="4151778"/>
                     </a:xfrm>
                     <a:prstGeom prst="rect"/>
                   </pic:spPr>
@@ -926,7 +801,7 @@
     </w:p>
     <w:p>
       <w:r>
-        <w:t>Interpretación: cada color representa observaciones con precio y volumen semejantes; son segmentos descriptivos, no clases causales ni pronósticos.</w:t>
+        <w:t>Interpretación: los grupos son segmentos descriptivos y no clases causales.</w:t>
       </w:r>
     </w:p>
     <w:p>
@@ -934,29 +809,22 @@
         <w:pStyle w:val="Heading1"/>
       </w:pPr>
       <w:r>
-        <w:t>SA 4. PCA para comprar o alquilar</w:t>
+        <w:t>SA 4. PCA</w:t>
       </w:r>
     </w:p>
     <w:p>
       <w:r>
-        <w:rPr>
-          <w:b/>
-        </w:rPr>
-        <w:t xml:space="preserve">Repositorio del modelo: </w:t>
+        <w:t>Repositorio del modelo: https://github.com/axelisaak10/evaluacion-2</w:t>
       </w:r>
-      <w:hyperlink r:id="rId23">
-        <w:r>
-          <w:rPr>
-            <w:color w:val="0563C1"/>
-            <w:u w:val="single"/>
-          </w:rPr>
-          <w:t>https://github.com/axelisaak10/evaluacion-2</w:t>
-        </w:r>
-      </w:hyperlink>
     </w:p>
     <w:p>
       <w:r>
-        <w:t>Justificación: PCA concentra varianza en ejes ortogonales. Sin escalamiento dominan las magnitudes monetarias; con StandardScaler cada variable contribuye de forma comparable. Se eligieron 6 componentes porque es el mínimo que conserva al menos 90% de la varianza.</w:t>
+        <w:t>Justificación: PCA resume variables correlacionadas en componentes ortogonales.</w:t>
+      </w:r>
+    </w:p>
+    <w:p>
+      <w:r>
+        <w:t>Diseño: Se compara sin y con StandardScaler; se elige el mínimo número de componentes que conserva 90% de varianza.</w:t>
       </w:r>
     </w:p>
     <w:p>
@@ -964,7 +832,7 @@
         <w:pStyle w:val="Heading2"/>
       </w:pPr>
       <w:r>
-        <w:t>Selección dimensional</w:t>
+        <w:t>Evaluación y optimización</w:t>
       </w:r>
     </w:p>
     <w:tbl>
@@ -972,12 +840,11 @@
         <w:tblStyle w:val="TableGrid"/>
         <w:tblW w:type="auto" w:w="0"/>
         <w:jc w:val="center"/>
-        <w:tblLayout w:type="fixed"/>
         <w:tblLook w:firstColumn="1" w:firstRow="1" w:lastColumn="0" w:lastRow="0" w:noHBand="0" w:noVBand="1" w:val="04A0"/>
       </w:tblPr>
       <w:tblGrid>
-        <w:gridCol w:w="3312"/>
-        <w:gridCol w:w="6048"/>
+        <w:gridCol w:w="4680"/>
+        <w:gridCol w:w="4680"/>
       </w:tblGrid>
       <w:tr>
         <w:tc>
@@ -1006,18 +873,18 @@
       <w:tr>
         <w:tc>
           <w:tcPr>
-            <w:tcW w:type="dxa" w:w="3312"/>
+            <w:tcW w:type="dxa" w:w="4680"/>
             <w:vAlign w:val="center"/>
           </w:tcPr>
           <w:p>
             <w:r>
-              <w:t>Componentes elegidos</w:t>
+              <w:t>Componentes</w:t>
             </w:r>
           </w:p>
         </w:tc>
         <w:tc>
           <w:tcPr>
-            <w:tcW w:type="dxa" w:w="6048"/>
+            <w:tcW w:type="dxa" w:w="4680"/>
             <w:vAlign w:val="center"/>
           </w:tcPr>
           <w:p>
@@ -1030,18 +897,18 @@
       <w:tr>
         <w:tc>
           <w:tcPr>
-            <w:tcW w:type="dxa" w:w="3312"/>
+            <w:tcW w:type="dxa" w:w="4680"/>
             <w:vAlign w:val="center"/>
           </w:tcPr>
           <w:p>
             <w:r>
-              <w:t>Varianza acumulada PC1-PC2 escalada</w:t>
+              <w:t>Varianza PC1-PC2</w:t>
             </w:r>
           </w:p>
         </w:tc>
         <w:tc>
           <w:tcPr>
-            <w:tcW w:type="dxa" w:w="6048"/>
+            <w:tcW w:type="dxa" w:w="4680"/>
             <w:vAlign w:val="center"/>
           </w:tcPr>
           <w:p>
@@ -1051,37 +918,13 @@
           </w:p>
         </w:tc>
       </w:tr>
-      <w:tr>
-        <w:tc>
-          <w:tcPr>
-            <w:tcW w:type="dxa" w:w="3312"/>
-            <w:vAlign w:val="center"/>
-          </w:tcPr>
-          <w:p>
-            <w:r>
-              <w:t>Umbral</w:t>
-            </w:r>
-          </w:p>
-        </w:tc>
-        <w:tc>
-          <w:tcPr>
-            <w:tcW w:type="dxa" w:w="6048"/>
-            <w:vAlign w:val="center"/>
-          </w:tcPr>
-          <w:p>
-            <w:r>
-              <w:t>0.9000</w:t>
-            </w:r>
-          </w:p>
-        </w:tc>
-      </w:tr>
     </w:tbl>
     <w:p>
       <w:r>
         <w:drawing>
           <wp:inline xmlns:a="http://schemas.openxmlformats.org/drawingml/2006/main" xmlns:pic="http://schemas.openxmlformats.org/drawingml/2006/picture">
-            <wp:extent cx="5852160" cy="2643778"/>
-            <wp:docPr id="7" name="Picture 7"/>
+            <wp:extent cx="5577840" cy="2519851"/>
+            <wp:docPr id="8" name="Picture 8"/>
             <wp:cNvGraphicFramePr>
               <a:graphicFrameLocks noChangeAspect="1"/>
             </wp:cNvGraphicFramePr>
@@ -1093,7 +936,7 @@
                     <pic:cNvPicPr/>
                   </pic:nvPicPr>
                   <pic:blipFill>
-                    <a:blip r:embed="rId17"/>
+                    <a:blip r:embed="rId16"/>
                     <a:stretch>
                       <a:fillRect/>
                     </a:stretch>
@@ -1101,7 +944,7 @@
                   <pic:spPr>
                     <a:xfrm>
                       <a:off x="0" y="0"/>
-                      <a:ext cx="5852160" cy="2643778"/>
+                      <a:ext cx="5577840" cy="2519851"/>
                     </a:xfrm>
                     <a:prstGeom prst="rect"/>
                   </pic:spPr>
@@ -1116,8 +959,8 @@
       <w:r>
         <w:drawing>
           <wp:inline xmlns:a="http://schemas.openxmlformats.org/drawingml/2006/main" xmlns:pic="http://schemas.openxmlformats.org/drawingml/2006/picture">
-            <wp:extent cx="5303520" cy="3264570"/>
-            <wp:docPr id="8" name="Picture 8"/>
+            <wp:extent cx="5577840" cy="3433427"/>
+            <wp:docPr id="9" name="Picture 9"/>
             <wp:cNvGraphicFramePr>
               <a:graphicFrameLocks noChangeAspect="1"/>
             </wp:cNvGraphicFramePr>
@@ -1129,7 +972,7 @@
                     <pic:cNvPicPr/>
                   </pic:nvPicPr>
                   <pic:blipFill>
-                    <a:blip r:embed="rId18"/>
+                    <a:blip r:embed="rId17"/>
                     <a:stretch>
                       <a:fillRect/>
                     </a:stretch>
@@ -1137,7 +980,7 @@
                   <pic:spPr>
                     <a:xfrm>
                       <a:off x="0" y="0"/>
-                      <a:ext cx="5303520" cy="3264570"/>
+                      <a:ext cx="5577840" cy="3433427"/>
                     </a:xfrm>
                     <a:prstGeom prst="rect"/>
                   </pic:spPr>
@@ -1150,7 +993,7 @@
     </w:p>
     <w:p>
       <w:r>
-        <w:t>Interpretación: el cambio de geometría confirma la necesidad de escalar. El color comprar se usa solo para interpretar separación, no para ajustar PCA.</w:t>
+        <w:t>Interpretación: el escalamiento evita que las variables monetarias dominen; seis componentes conservan al menos 90%.</w:t>
       </w:r>
     </w:p>
     <w:p>
@@ -1158,29 +1001,22 @@
         <w:pStyle w:val="Heading1"/>
       </w:pPr>
       <w:r>
-        <w:t>DE 1. Clasificación alterna - Regresión logística</w:t>
+        <w:t>DE 1. SVM alterno</w:t>
       </w:r>
     </w:p>
     <w:p>
       <w:r>
-        <w:rPr>
-          <w:b/>
-        </w:rPr>
-        <w:t xml:space="preserve">Repositorio del modelo: </w:t>
+        <w:t>Repositorio del modelo: https://github.com/axelisaak10/evaluacion-2</w:t>
       </w:r>
-      <w:hyperlink r:id="rId23">
-        <w:r>
-          <w:rPr>
-            <w:color w:val="0563C1"/>
-            <w:u w:val="single"/>
-          </w:rPr>
-          <w:t>https://github.com/axelisaak10/evaluacion-2</w:t>
-        </w:r>
-      </w:hyperlink>
     </w:p>
     <w:p>
       <w:r>
-        <w:t>Justificación: ofrece probabilidades y una frontera lineal regularizada, alternativa conceptual al árbol. El escalamiento vive dentro del Pipeline para evitar fuga; se optimizaron C y penalización con AUC estratificada.</w:t>
+        <w:t>Justificación: SVM es distinto a logística y árbol de SA y puede formar fronteras no lineales.</w:t>
+      </w:r>
+    </w:p>
+    <w:p>
+      <w:r>
+        <w:t>Diseño: Pipeline con escalamiento; búsqueda de C, kernel y gamma con AUC estratificada; prueba 20% aislada.</w:t>
       </w:r>
     </w:p>
     <w:p>
@@ -1196,12 +1032,11 @@
         <w:tblStyle w:val="TableGrid"/>
         <w:tblW w:type="auto" w:w="0"/>
         <w:jc w:val="center"/>
-        <w:tblLayout w:type="fixed"/>
         <w:tblLook w:firstColumn="1" w:firstRow="1" w:lastColumn="0" w:lastRow="0" w:noHBand="0" w:noVBand="1" w:val="04A0"/>
       </w:tblPr>
       <w:tblGrid>
-        <w:gridCol w:w="3312"/>
-        <w:gridCol w:w="6048"/>
+        <w:gridCol w:w="4680"/>
+        <w:gridCol w:w="4680"/>
       </w:tblGrid>
       <w:tr>
         <w:tc>
@@ -1230,7 +1065,31 @@
       <w:tr>
         <w:tc>
           <w:tcPr>
-            <w:tcW w:type="dxa" w:w="3312"/>
+            <w:tcW w:type="dxa" w:w="4680"/>
+            <w:vAlign w:val="center"/>
+          </w:tcPr>
+          <w:p>
+            <w:r>
+              <w:t>AUC</w:t>
+            </w:r>
+          </w:p>
+        </w:tc>
+        <w:tc>
+          <w:tcPr>
+            <w:tcW w:type="dxa" w:w="4680"/>
+            <w:vAlign w:val="center"/>
+          </w:tcPr>
+          <w:p>
+            <w:r>
+              <w:t>0.9964</w:t>
+            </w:r>
+          </w:p>
+        </w:tc>
+      </w:tr>
+      <w:tr>
+        <w:tc>
+          <w:tcPr>
+            <w:tcW w:type="dxa" w:w="4680"/>
             <w:vAlign w:val="center"/>
           </w:tcPr>
           <w:p>
@@ -1241,12 +1100,12 @@
         </w:tc>
         <w:tc>
           <w:tcPr>
-            <w:tcW w:type="dxa" w:w="6048"/>
+            <w:tcW w:type="dxa" w:w="4680"/>
             <w:vAlign w:val="center"/>
           </w:tcPr>
           <w:p>
             <w:r>
-              <w:t>0.9737</w:t>
+              <w:t>0.9912</w:t>
             </w:r>
           </w:p>
         </w:tc>
@@ -1254,31 +1113,7 @@
       <w:tr>
         <w:tc>
           <w:tcPr>
-            <w:tcW w:type="dxa" w:w="3312"/>
-            <w:vAlign w:val="center"/>
-          </w:tcPr>
-          <w:p>
-            <w:r>
-              <w:t>precision</w:t>
-            </w:r>
-          </w:p>
-        </w:tc>
-        <w:tc>
-          <w:tcPr>
-            <w:tcW w:type="dxa" w:w="6048"/>
-            <w:vAlign w:val="center"/>
-          </w:tcPr>
-          <w:p>
-            <w:r>
-              <w:t>0.9756</w:t>
-            </w:r>
-          </w:p>
-        </w:tc>
-      </w:tr>
-      <w:tr>
-        <w:tc>
-          <w:tcPr>
-            <w:tcW w:type="dxa" w:w="3312"/>
+            <w:tcW w:type="dxa" w:w="4680"/>
             <w:vAlign w:val="center"/>
           </w:tcPr>
           <w:p>
@@ -1289,12 +1124,12 @@
         </w:tc>
         <w:tc>
           <w:tcPr>
-            <w:tcW w:type="dxa" w:w="6048"/>
+            <w:tcW w:type="dxa" w:w="4680"/>
             <w:vAlign w:val="center"/>
           </w:tcPr>
           <w:p>
             <w:r>
-              <w:t>0.9524</w:t>
+              <w:t>0.9762</w:t>
             </w:r>
           </w:p>
         </w:tc>
@@ -1302,95 +1137,23 @@
       <w:tr>
         <w:tc>
           <w:tcPr>
-            <w:tcW w:type="dxa" w:w="3312"/>
+            <w:tcW w:type="dxa" w:w="4680"/>
             <w:vAlign w:val="center"/>
           </w:tcPr>
           <w:p>
             <w:r>
-              <w:t>f1</w:t>
+              <w:t>Parámetros</w:t>
             </w:r>
           </w:p>
         </w:tc>
         <w:tc>
           <w:tcPr>
-            <w:tcW w:type="dxa" w:w="6048"/>
+            <w:tcW w:type="dxa" w:w="4680"/>
             <w:vAlign w:val="center"/>
           </w:tcPr>
           <w:p>
             <w:r>
-              <w:t>0.9639</w:t>
-            </w:r>
-          </w:p>
-        </w:tc>
-      </w:tr>
-      <w:tr>
-        <w:tc>
-          <w:tcPr>
-            <w:tcW w:type="dxa" w:w="3312"/>
-            <w:vAlign w:val="center"/>
-          </w:tcPr>
-          <w:p>
-            <w:r>
-              <w:t>roc_auc</w:t>
-            </w:r>
-          </w:p>
-        </w:tc>
-        <w:tc>
-          <w:tcPr>
-            <w:tcW w:type="dxa" w:w="6048"/>
-            <w:vAlign w:val="center"/>
-          </w:tcPr>
-          <w:p>
-            <w:r>
-              <w:t>0.9954</w:t>
-            </w:r>
-          </w:p>
-        </w:tc>
-      </w:tr>
-      <w:tr>
-        <w:tc>
-          <w:tcPr>
-            <w:tcW w:type="dxa" w:w="3312"/>
-            <w:vAlign w:val="center"/>
-          </w:tcPr>
-          <w:p>
-            <w:r>
-              <w:t>CV AUC</w:t>
-            </w:r>
-          </w:p>
-        </w:tc>
-        <w:tc>
-          <w:tcPr>
-            <w:tcW w:type="dxa" w:w="6048"/>
-            <w:vAlign w:val="center"/>
-          </w:tcPr>
-          <w:p>
-            <w:r>
-              <w:t>0.9954</w:t>
-            </w:r>
-          </w:p>
-        </w:tc>
-      </w:tr>
-      <w:tr>
-        <w:tc>
-          <w:tcPr>
-            <w:tcW w:type="dxa" w:w="3312"/>
-            <w:vAlign w:val="center"/>
-          </w:tcPr>
-          <w:p>
-            <w:r>
-              <w:t>Mejores parámetros</w:t>
-            </w:r>
-          </w:p>
-        </w:tc>
-        <w:tc>
-          <w:tcPr>
-            <w:tcW w:type="dxa" w:w="6048"/>
-            <w:vAlign w:val="center"/>
-          </w:tcPr>
-          <w:p>
-            <w:r>
-              <w:t>{'log__C': 1, 'log__penalty': 'l2', 'log__solver': 'liblinear'}</w:t>
+              <w:t>{'svc__C': 0.1, 'svc__gamma': 'scale', 'svc__kernel': 'linear'}</w:t>
             </w:r>
           </w:p>
         </w:tc>
@@ -1400,8 +1163,8 @@
       <w:r>
         <w:drawing>
           <wp:inline xmlns:a="http://schemas.openxmlformats.org/drawingml/2006/main" xmlns:pic="http://schemas.openxmlformats.org/drawingml/2006/picture">
-            <wp:extent cx="4389120" cy="3811489"/>
-            <wp:docPr id="9" name="Picture 9"/>
+            <wp:extent cx="5577840" cy="2324661"/>
+            <wp:docPr id="10" name="Picture 10"/>
             <wp:cNvGraphicFramePr>
               <a:graphicFrameLocks noChangeAspect="1"/>
             </wp:cNvGraphicFramePr>
@@ -1409,11 +1172,11 @@
               <a:graphicData uri="http://schemas.openxmlformats.org/drawingml/2006/picture">
                 <pic:pic>
                   <pic:nvPicPr>
-                    <pic:cNvPr id="0" name="de_matriz_confusion.png"/>
+                    <pic:cNvPr id="0" name="de_svm_evaluacion.png"/>
                     <pic:cNvPicPr/>
                   </pic:nvPicPr>
                   <pic:blipFill>
-                    <a:blip r:embed="rId19"/>
+                    <a:blip r:embed="rId18"/>
                     <a:stretch>
                       <a:fillRect/>
                     </a:stretch>
@@ -1421,7 +1184,7 @@
                   <pic:spPr>
                     <a:xfrm>
                       <a:off x="0" y="0"/>
-                      <a:ext cx="4389120" cy="3811489"/>
+                      <a:ext cx="5577840" cy="2324661"/>
                     </a:xfrm>
                     <a:prstGeom prst="rect"/>
                   </pic:spPr>
@@ -1434,43 +1197,7 @@
     </w:p>
     <w:p>
       <w:r>
-        <w:drawing>
-          <wp:inline xmlns:a="http://schemas.openxmlformats.org/drawingml/2006/main" xmlns:pic="http://schemas.openxmlformats.org/drawingml/2006/picture">
-            <wp:extent cx="5029200" cy="5083998"/>
-            <wp:docPr id="10" name="Picture 10"/>
-            <wp:cNvGraphicFramePr>
-              <a:graphicFrameLocks noChangeAspect="1"/>
-            </wp:cNvGraphicFramePr>
-            <a:graphic>
-              <a:graphicData uri="http://schemas.openxmlformats.org/drawingml/2006/picture">
-                <pic:pic>
-                  <pic:nvPicPr>
-                    <pic:cNvPr id="0" name="de_curva_roc.png"/>
-                    <pic:cNvPicPr/>
-                  </pic:nvPicPr>
-                  <pic:blipFill>
-                    <a:blip r:embed="rId20"/>
-                    <a:stretch>
-                      <a:fillRect/>
-                    </a:stretch>
-                  </pic:blipFill>
-                  <pic:spPr>
-                    <a:xfrm>
-                      <a:off x="0" y="0"/>
-                      <a:ext cx="5029200" cy="5083998"/>
-                    </a:xfrm>
-                    <a:prstGeom prst="rect"/>
-                  </pic:spPr>
-                </pic:pic>
-              </a:graphicData>
-            </a:graphic>
-          </wp:inline>
-        </w:drawing>
-      </w:r>
-    </w:p>
-    <w:p>
-      <w:r>
-        <w:t>Interpretación: el AUC resume discriminación en todos los umbrales; la matriz corresponde al umbral 0.5.</w:t>
+        <w:t>Interpretación: AUC resume separación y la matriz muestra errores al umbral elegido.</w:t>
       </w:r>
     </w:p>
     <w:p>
@@ -1478,29 +1205,22 @@
         <w:pStyle w:val="Heading1"/>
       </w:pPr>
       <w:r>
-        <w:t>DE 2. Regresión alterna - Ridge</w:t>
+        <w:t>DE 2. Random Forest alterno</w:t>
       </w:r>
     </w:p>
     <w:p>
       <w:r>
-        <w:rPr>
-          <w:b/>
-        </w:rPr>
-        <w:t xml:space="preserve">Repositorio del modelo: </w:t>
+        <w:t>Repositorio del modelo: https://github.com/axelisaak10/evaluacion-2</w:t>
       </w:r>
-      <w:hyperlink r:id="rId23">
-        <w:r>
-          <w:rPr>
-            <w:color w:val="0563C1"/>
-            <w:u w:val="single"/>
-          </w:rPr>
-          <w:t>https://github.com/axelisaak10/evaluacion-2</w:t>
-        </w:r>
-      </w:hyperlink>
     </w:p>
     <w:p>
       <w:r>
-        <w:t>Justificación: Ridge regulariza una relación polinómica y controla coeficientes inestables, alternativa parsimoniosa al bosque. Se optimizaron grado y alpha mediante RMSE en cinco pliegues.</w:t>
+        <w:t>Justificación: Random Forest es distinto a los modelos lineales de SA y captura relaciones no lineales.</w:t>
+      </w:r>
+    </w:p>
+    <w:p>
+      <w:r>
+        <w:t>Diseño: División 75/25; búsqueda de árboles, profundidad y hojas; RMSE en cinco pliegues.</w:t>
       </w:r>
     </w:p>
     <w:p>
@@ -1516,12 +1236,11 @@
         <w:tblStyle w:val="TableGrid"/>
         <w:tblW w:type="auto" w:w="0"/>
         <w:jc w:val="center"/>
-        <w:tblLayout w:type="fixed"/>
         <w:tblLook w:firstColumn="1" w:firstRow="1" w:lastColumn="0" w:lastRow="0" w:noHBand="0" w:noVBand="1" w:val="04A0"/>
       </w:tblPr>
       <w:tblGrid>
-        <w:gridCol w:w="3312"/>
-        <w:gridCol w:w="6048"/>
+        <w:gridCol w:w="4680"/>
+        <w:gridCol w:w="4680"/>
       </w:tblGrid>
       <w:tr>
         <w:tc>
@@ -1550,7 +1269,55 @@
       <w:tr>
         <w:tc>
           <w:tcPr>
-            <w:tcW w:type="dxa" w:w="3312"/>
+            <w:tcW w:type="dxa" w:w="4680"/>
+            <w:vAlign w:val="center"/>
+          </w:tcPr>
+          <w:p>
+            <w:r>
+              <w:t>R2</w:t>
+            </w:r>
+          </w:p>
+        </w:tc>
+        <w:tc>
+          <w:tcPr>
+            <w:tcW w:type="dxa" w:w="4680"/>
+            <w:vAlign w:val="center"/>
+          </w:tcPr>
+          <w:p>
+            <w:r>
+              <w:t>-0.3346</w:t>
+            </w:r>
+          </w:p>
+        </w:tc>
+      </w:tr>
+      <w:tr>
+        <w:tc>
+          <w:tcPr>
+            <w:tcW w:type="dxa" w:w="4680"/>
+            <w:vAlign w:val="center"/>
+          </w:tcPr>
+          <w:p>
+            <w:r>
+              <w:t>RMSE</w:t>
+            </w:r>
+          </w:p>
+        </w:tc>
+        <w:tc>
+          <w:tcPr>
+            <w:tcW w:type="dxa" w:w="4680"/>
+            <w:vAlign w:val="center"/>
+          </w:tcPr>
+          <w:p>
+            <w:r>
+              <w:t>67.6316</w:t>
+            </w:r>
+          </w:p>
+        </w:tc>
+      </w:tr>
+      <w:tr>
+        <w:tc>
+          <w:tcPr>
+            <w:tcW w:type="dxa" w:w="4680"/>
             <w:vAlign w:val="center"/>
           </w:tcPr>
           <w:p>
@@ -1561,12 +1328,12 @@
         </w:tc>
         <w:tc>
           <w:tcPr>
-            <w:tcW w:type="dxa" w:w="6048"/>
+            <w:tcW w:type="dxa" w:w="4680"/>
             <w:vAlign w:val="center"/>
           </w:tcPr>
           <w:p>
             <w:r>
-              <w:t>51.5635</w:t>
+              <w:t>54.1543</w:t>
             </w:r>
           </w:p>
         </w:tc>
@@ -1574,95 +1341,23 @@
       <w:tr>
         <w:tc>
           <w:tcPr>
-            <w:tcW w:type="dxa" w:w="3312"/>
+            <w:tcW w:type="dxa" w:w="4680"/>
             <w:vAlign w:val="center"/>
           </w:tcPr>
           <w:p>
             <w:r>
-              <w:t>RMSE</w:t>
+              <w:t>Parámetros</w:t>
             </w:r>
           </w:p>
         </w:tc>
         <w:tc>
           <w:tcPr>
-            <w:tcW w:type="dxa" w:w="6048"/>
+            <w:tcW w:type="dxa" w:w="4680"/>
             <w:vAlign w:val="center"/>
           </w:tcPr>
           <w:p>
             <w:r>
-              <w:t>66.1970</w:t>
-            </w:r>
-          </w:p>
-        </w:tc>
-      </w:tr>
-      <w:tr>
-        <w:tc>
-          <w:tcPr>
-            <w:tcW w:type="dxa" w:w="3312"/>
-            <w:vAlign w:val="center"/>
-          </w:tcPr>
-          <w:p>
-            <w:r>
-              <w:t>R2</w:t>
-            </w:r>
-          </w:p>
-        </w:tc>
-        <w:tc>
-          <w:tcPr>
-            <w:tcW w:type="dxa" w:w="6048"/>
-            <w:vAlign w:val="center"/>
-          </w:tcPr>
-          <w:p>
-            <w:r>
-              <w:t>-0.2786</w:t>
-            </w:r>
-          </w:p>
-        </w:tc>
-      </w:tr>
-      <w:tr>
-        <w:tc>
-          <w:tcPr>
-            <w:tcW w:type="dxa" w:w="3312"/>
-            <w:vAlign w:val="center"/>
-          </w:tcPr>
-          <w:p>
-            <w:r>
-              <w:t>CV RMSE</w:t>
-            </w:r>
-          </w:p>
-        </w:tc>
-        <w:tc>
-          <w:tcPr>
-            <w:tcW w:type="dxa" w:w="6048"/>
-            <w:vAlign w:val="center"/>
-          </w:tcPr>
-          <w:p>
-            <w:r>
-              <w:t>71.5652</w:t>
-            </w:r>
-          </w:p>
-        </w:tc>
-      </w:tr>
-      <w:tr>
-        <w:tc>
-          <w:tcPr>
-            <w:tcW w:type="dxa" w:w="3312"/>
-            <w:vAlign w:val="center"/>
-          </w:tcPr>
-          <w:p>
-            <w:r>
-              <w:t>Mejores parámetros</w:t>
-            </w:r>
-          </w:p>
-        </w:tc>
-        <w:tc>
-          <w:tcPr>
-            <w:tcW w:type="dxa" w:w="6048"/>
-            <w:vAlign w:val="center"/>
-          </w:tcPr>
-          <w:p>
-            <w:r>
-              <w:t>{'poly__degree': 1, 'ridge__alpha': 10}</w:t>
+              <w:t>{'max_depth': None, 'min_samples_leaf': 3, 'n_estimators': 300}</w:t>
             </w:r>
           </w:p>
         </w:tc>
@@ -1672,7 +1367,7 @@
       <w:r>
         <w:drawing>
           <wp:inline xmlns:a="http://schemas.openxmlformats.org/drawingml/2006/main" xmlns:pic="http://schemas.openxmlformats.org/drawingml/2006/picture">
-            <wp:extent cx="5669280" cy="3487248"/>
+            <wp:extent cx="5577840" cy="3431002"/>
             <wp:docPr id="11" name="Picture 11"/>
             <wp:cNvGraphicFramePr>
               <a:graphicFrameLocks noChangeAspect="1"/>
@@ -1681,11 +1376,11 @@
               <a:graphicData uri="http://schemas.openxmlformats.org/drawingml/2006/picture">
                 <pic:pic>
                   <pic:nvPicPr>
-                    <pic:cNvPr id="0" name="de_beisbol_dispersion.png"/>
+                    <pic:cNvPr id="0" name="de_random_forest_beisbol.png"/>
                     <pic:cNvPicPr/>
                   </pic:nvPicPr>
                   <pic:blipFill>
-                    <a:blip r:embed="rId21"/>
+                    <a:blip r:embed="rId19"/>
                     <a:stretch>
                       <a:fillRect/>
                     </a:stretch>
@@ -1693,7 +1388,7 @@
                   <pic:spPr>
                     <a:xfrm>
                       <a:off x="0" y="0"/>
-                      <a:ext cx="5669280" cy="3487248"/>
+                      <a:ext cx="5577840" cy="3431002"/>
                     </a:xfrm>
                     <a:prstGeom prst="rect"/>
                   </pic:spPr>
@@ -1708,7 +1403,7 @@
       <w:r>
         <w:drawing>
           <wp:inline xmlns:a="http://schemas.openxmlformats.org/drawingml/2006/main" xmlns:pic="http://schemas.openxmlformats.org/drawingml/2006/picture">
-            <wp:extent cx="4937760" cy="4914380"/>
+            <wp:extent cx="5577840" cy="5551430"/>
             <wp:docPr id="12" name="Picture 12"/>
             <wp:cNvGraphicFramePr>
               <a:graphicFrameLocks noChangeAspect="1"/>
@@ -1717,11 +1412,11 @@
               <a:graphicData uri="http://schemas.openxmlformats.org/drawingml/2006/picture">
                 <pic:pic>
                   <pic:nvPicPr>
-                    <pic:cNvPr id="0" name="de_beisbol_real_vs_predicho.png"/>
+                    <pic:cNvPr id="0" name="de_random_forest_real_vs_predicho.png"/>
                     <pic:cNvPicPr/>
                   </pic:nvPicPr>
                   <pic:blipFill>
-                    <a:blip r:embed="rId22"/>
+                    <a:blip r:embed="rId20"/>
                     <a:stretch>
                       <a:fillRect/>
                     </a:stretch>
@@ -1729,7 +1424,7 @@
                   <pic:spPr>
                     <a:xfrm>
                       <a:off x="0" y="0"/>
-                      <a:ext cx="4937760" cy="4914380"/>
+                      <a:ext cx="5577840" cy="5551430"/>
                     </a:xfrm>
                     <a:prstGeom prst="rect"/>
                   </pic:spPr>
@@ -1742,7 +1437,7 @@
     </w:p>
     <w:p>
       <w:r>
-        <w:t>Interpretación: la curva resume la tendencia global; la dispersión alrededor de la diagonal representa error no explicado por bateos.</w:t>
+        <w:t>Interpretación: el conjunto pequeño limita la generalización; la gráfica real-predicho hace visible el error.</w:t>
       </w:r>
     </w:p>
     <w:p>
@@ -1750,119 +1445,22 @@
         <w:pStyle w:val="Heading1"/>
       </w:pPr>
       <w:r>
-        <w:t>Conclusiones y limitaciones</w:t>
-      </w:r>
-    </w:p>
-    <w:p>
-      <w:pPr>
-        <w:pStyle w:val="ListBullet"/>
-      </w:pPr>
-      <w:r>
-        <w:t>La evaluación separada reduce sesgo, pero el conjunto de béisbol es muy pequeño y el resultado depende de la partición.</w:t>
-      </w:r>
-    </w:p>
-    <w:p>
-      <w:pPr>
-        <w:pStyle w:val="ListBullet"/>
-      </w:pPr>
-      <w:r>
-        <w:t>En cáncer, AUC y recall complementan accuracy ante el costo de falsos negativos.</w:t>
-      </w:r>
-    </w:p>
-    <w:p>
-      <w:pPr>
-        <w:pStyle w:val="ListBullet"/>
-      </w:pPr>
-      <w:r>
-        <w:t>K-means supone grupos aproximadamente esféricos y es sensible a atípicos.</w:t>
-      </w:r>
-    </w:p>
-    <w:p>
-      <w:pPr>
-        <w:pStyle w:val="ListBullet"/>
-      </w:pPr>
-      <w:r>
-        <w:t>PCA maximiza varianza, no necesariamente utilidad predictiva o causal.</w:t>
-      </w:r>
-    </w:p>
-    <w:p>
-      <w:pPr>
-        <w:pStyle w:val="ListBullet"/>
-      </w:pPr>
-      <w:r>
-        <w:t>Los modelos son ejercicios académicos y no deben usarse para decisiones clínicas o financieras reales.</w:t>
-      </w:r>
-    </w:p>
-    <w:p>
-      <w:pPr>
-        <w:pStyle w:val="Heading1"/>
-      </w:pPr>
-      <w:r>
-        <w:t>Repositorio y reproducibilidad</w:t>
+        <w:t>Conclusiones</w:t>
       </w:r>
     </w:p>
     <w:p>
       <w:r>
-        <w:rPr>
-          <w:b/>
-        </w:rPr>
-        <w:t xml:space="preserve">Repositorio público de la entrega y de todos los modelos: </w:t>
-      </w:r>
-      <w:hyperlink r:id="rId23">
-        <w:r>
-          <w:rPr>
-            <w:color w:val="0563C1"/>
-            <w:u w:val="single"/>
-          </w:rPr>
-          <w:t>https://github.com/axelisaak10/evaluacion-2</w:t>
-        </w:r>
-      </w:hyperlink>
-      <w:r>
-        <w:t>. Incluye datos, seis notebooks ejecutados, modelos joblib, métricas JSON/CSV, figuras y dependencias.</w:t>
+        <w:t>La selección solicitada para SA quedó implementada y comparada. DE conserva algoritmos alternos, evitando repetir los enfoques de SA. Los resultados son académicos y no deben usarse para decisiones clínicas o financieras reales.</w:t>
       </w:r>
     </w:p>
     <w:sectPr>
-      <w:headerReference w:type="default" r:id="rId9"/>
-      <w:footerReference w:type="default" r:id="rId10"/>
       <w:pgSz w:w="12240" w:h="15840"/>
-      <w:pgMar w:top="1440" w:right="1440" w:bottom="1440" w:left="1440" w:header="708" w:footer="708" w:gutter="0"/>
+      <w:pgMar w:top="1440" w:right="1440" w:bottom="1440" w:left="1440" w:header="720" w:footer="720" w:gutter="0"/>
       <w:cols w:space="720"/>
       <w:docGrid w:linePitch="360"/>
     </w:sectPr>
   </w:body>
 </w:document>
-</file>
-
-<file path=word/footer1.xml><?xml version="1.0" encoding="utf-8"?>
-<w:ftr xmlns:m="http://schemas.openxmlformats.org/officeDocument/2006/math" xmlns:mc="http://schemas.openxmlformats.org/markup-compatibility/2006" xmlns:mo="http://schemas.microsoft.com/office/mac/office/2008/main" xmlns:mv="urn:schemas-microsoft-com:mac:vml" xmlns:o="urn:schemas-microsoft-com:office:office" xmlns:r="http://schemas.openxmlformats.org/officeDocument/2006/relationships" xmlns:v="urn:schemas-microsoft-com:vml" xmlns:w10="urn:schemas-microsoft-com:office:word" xmlns:w14="http://schemas.microsoft.com/office/word/2010/wordml" xmlns:w="http://schemas.openxmlformats.org/wordprocessingml/2006/main" xmlns:wne="http://schemas.microsoft.com/office/word/2006/wordml" xmlns:wp14="http://schemas.microsoft.com/office/word/2010/wordprocessingDrawing" xmlns:wp="http://schemas.openxmlformats.org/drawingml/2006/wordprocessingDrawing" xmlns:wpc="http://schemas.microsoft.com/office/word/2010/wordprocessingCanvas" xmlns:wpg="http://schemas.microsoft.com/office/word/2010/wordprocessingGroup" xmlns:wpi="http://schemas.microsoft.com/office/word/2010/wordprocessingInk" xmlns:wps="http://schemas.microsoft.com/office/word/2010/wordprocessingShape" mc:Ignorable="w14 wp14">
-  <w:p>
-    <w:pPr>
-      <w:pStyle w:val="Footer"/>
-      <w:jc w:val="center"/>
-    </w:pPr>
-    <w:r>
-      <w:t>Reporte académico reproducible</w:t>
-    </w:r>
-  </w:p>
-</w:ftr>
-</file>
-
-<file path=word/header1.xml><?xml version="1.0" encoding="utf-8"?>
-<w:hdr xmlns:m="http://schemas.openxmlformats.org/officeDocument/2006/math" xmlns:mc="http://schemas.openxmlformats.org/markup-compatibility/2006" xmlns:mo="http://schemas.microsoft.com/office/mac/office/2008/main" xmlns:mv="urn:schemas-microsoft-com:mac:vml" xmlns:o="urn:schemas-microsoft-com:office:office" xmlns:r="http://schemas.openxmlformats.org/officeDocument/2006/relationships" xmlns:v="urn:schemas-microsoft-com:vml" xmlns:w10="urn:schemas-microsoft-com:office:word" xmlns:w14="http://schemas.microsoft.com/office/word/2010/wordml" xmlns:w="http://schemas.openxmlformats.org/wordprocessingml/2006/main" xmlns:wne="http://schemas.microsoft.com/office/word/2006/wordml" xmlns:wp14="http://schemas.microsoft.com/office/word/2010/wordprocessingDrawing" xmlns:wp="http://schemas.openxmlformats.org/drawingml/2006/wordprocessingDrawing" xmlns:wpc="http://schemas.microsoft.com/office/word/2010/wordprocessingCanvas" xmlns:wpg="http://schemas.microsoft.com/office/word/2010/wordprocessingGroup" xmlns:wpi="http://schemas.microsoft.com/office/word/2010/wordprocessingInk" xmlns:wps="http://schemas.microsoft.com/office/word/2010/wordprocessingShape" mc:Ignorable="w14 wp14">
-  <w:p>
-    <w:pPr>
-      <w:pStyle w:val="Header"/>
-      <w:jc w:val="right"/>
-    </w:pPr>
-    <w:r>
-      <w:rPr>
-        <w:color w:val="646464"/>
-        <w:sz w:val="16"/>
-      </w:rPr>
-      <w:t>ANÁLISIS DE APRENDIZAJE AUTOMÁTICO | SA · DE · AU</w:t>
-    </w:r>
-  </w:p>
-</w:hdr>
 </file>
 
 <file path=word/numbering.xml><?xml version="1.0" encoding="utf-8"?>
@@ -2341,15 +1939,14 @@
     <w:pPr>
       <w:keepNext/>
       <w:keepLines/>
-      <w:spacing w:before="160" w:after="80" w:line="264" w:lineRule="auto"/>
+      <w:spacing w:before="200" w:after="0"/>
       <w:outlineLvl w:val="2"/>
     </w:pPr>
     <w:rPr>
-      <w:rFonts w:asciiTheme="majorHAnsi" w:eastAsiaTheme="majorEastAsia" w:hAnsiTheme="majorHAnsi" w:cstheme="majorBidi" w:ascii="Calibri" w:hAnsi="Calibri"/>
+      <w:rFonts w:asciiTheme="majorHAnsi" w:eastAsiaTheme="majorEastAsia" w:hAnsiTheme="majorHAnsi" w:cstheme="majorBidi"/>
       <w:b/>
       <w:bCs/>
-      <w:color w:val="1F4D78"/>
-      <w:sz w:val="24"/>
+      <w:color w:val="4F81BD" w:themeColor="accent1"/>
     </w:rPr>
   </w:style>
   <w:style w:type="paragraph" w:styleId="Heading4">

</xml_diff>